<commit_message>
Manga - Pupa Volume 2 - 12/7/2025
</commit_message>
<xml_diff>
--- a/Manga/Pupa/1-Core (size)/English/MangaDex/1-Volume 1/Sources - Volume 1.docx
+++ b/Manga/Pupa/1-Core (size)/English/MangaDex/1-Volume 1/Sources - Volume 1.docx
@@ -204,13 +204,23 @@
         </w:rPr>
         <w:t xml:space="preserve"> </w:t>
       </w:r>
-      <w:r>
-        <w:rPr>
-          <w:bCs/>
-          <w:sz w:val="18"/>
-          <w:szCs w:val="18"/>
-        </w:rPr>
-        <w:t>MangaDex (https://mangadex.org)</w:t>
+      <w:proofErr w:type="spellStart"/>
+      <w:r>
+        <w:rPr>
+          <w:bCs/>
+          <w:sz w:val="18"/>
+          <w:szCs w:val="18"/>
+        </w:rPr>
+        <w:t>MangaDex</w:t>
+      </w:r>
+      <w:proofErr w:type="spellEnd"/>
+      <w:r>
+        <w:rPr>
+          <w:bCs/>
+          <w:sz w:val="18"/>
+          <w:szCs w:val="18"/>
+        </w:rPr>
+        <w:t xml:space="preserve"> (https://mangadex.org)</w:t>
       </w:r>
     </w:p>
     <w:p>
@@ -245,6 +255,33 @@
         <w:t xml:space="preserve"> </w:t>
       </w:r>
       <w:hyperlink r:id="rId6" w:history="1">
+        <w:r>
+          <w:rPr>
+            <w:rStyle w:val="Hyperlink"/>
+            <w:bCs/>
+            <w:sz w:val="18"/>
+            <w:szCs w:val="18"/>
+          </w:rPr>
+          <w:t>https://mangadex.org/title/f4f3c1b5-a16e-4eca-9bc9-7a9c373a6370/pupa?tab=chapters</w:t>
+        </w:r>
+      </w:hyperlink>
+      <w:r>
+        <w:rPr>
+          <w:bCs/>
+          <w:sz w:val="18"/>
+          <w:szCs w:val="18"/>
+        </w:rPr>
+        <w:t xml:space="preserve"> -&gt;</w:t>
+      </w:r>
+      <w:r>
+        <w:rPr>
+          <w:b/>
+          <w:sz w:val="18"/>
+          <w:szCs w:val="18"/>
+        </w:rPr>
+        <w:t xml:space="preserve"> </w:t>
+      </w:r>
+      <w:hyperlink r:id="rId7" w:history="1">
         <w:r>
           <w:rPr>
             <w:rStyle w:val="Hyperlink"/>
@@ -301,7 +338,43 @@
           <w:sz w:val="18"/>
           <w:szCs w:val="18"/>
         </w:rPr>
-        <w:t>https://mangadex.org [MangaDex Server] -&gt; [JManga (Ex-Licenses) User]</w:t>
+        <w:t>https://mangadex.org [</w:t>
+      </w:r>
+      <w:proofErr w:type="spellStart"/>
+      <w:r>
+        <w:rPr>
+          <w:bCs/>
+          <w:sz w:val="18"/>
+          <w:szCs w:val="18"/>
+        </w:rPr>
+        <w:t>MangaDex</w:t>
+      </w:r>
+      <w:proofErr w:type="spellEnd"/>
+      <w:r>
+        <w:rPr>
+          <w:bCs/>
+          <w:sz w:val="18"/>
+          <w:szCs w:val="18"/>
+        </w:rPr>
+        <w:t xml:space="preserve"> Server] -&gt; [</w:t>
+      </w:r>
+      <w:proofErr w:type="spellStart"/>
+      <w:r>
+        <w:rPr>
+          <w:bCs/>
+          <w:sz w:val="18"/>
+          <w:szCs w:val="18"/>
+        </w:rPr>
+        <w:t>JManga</w:t>
+      </w:r>
+      <w:proofErr w:type="spellEnd"/>
+      <w:r>
+        <w:rPr>
+          <w:bCs/>
+          <w:sz w:val="18"/>
+          <w:szCs w:val="18"/>
+        </w:rPr>
+        <w:t xml:space="preserve"> (Ex-Licenses) User]</w:t>
       </w:r>
     </w:p>
     <w:p>
@@ -431,7 +504,7 @@
         </w:rPr>
         <w:t>(</w:t>
       </w:r>
-      <w:hyperlink r:id="rId7" w:history="1">
+      <w:hyperlink r:id="rId8" w:history="1">
         <w:r>
           <w:rPr>
             <w:rStyle w:val="Hyperlink"/>
@@ -474,7 +547,7 @@
         </w:rPr>
         <w:t xml:space="preserve"> (</w:t>
       </w:r>
-      <w:hyperlink r:id="rId8" w:history="1">
+      <w:hyperlink r:id="rId9" w:history="1">
         <w:r>
           <w:rPr>
             <w:rStyle w:val="Hyperlink"/>
@@ -741,13 +814,59 @@
         </w:rPr>
         <w:t xml:space="preserve"> </w:t>
       </w:r>
-      <w:r>
-        <w:rPr>
-          <w:bCs/>
-          <w:sz w:val="18"/>
-          <w:szCs w:val="18"/>
-        </w:rPr>
-        <w:t>StorageType: Cloud -&gt; Platform: GitHub -&gt; Account: animekingdomelbaf -&gt; Repository: kingdomheartsManga -&gt; File: Manga/Pupa/..</w:t>
+      <w:proofErr w:type="spellStart"/>
+      <w:r>
+        <w:rPr>
+          <w:bCs/>
+          <w:sz w:val="18"/>
+          <w:szCs w:val="18"/>
+        </w:rPr>
+        <w:t>StorageType</w:t>
+      </w:r>
+      <w:proofErr w:type="spellEnd"/>
+      <w:r>
+        <w:rPr>
+          <w:bCs/>
+          <w:sz w:val="18"/>
+          <w:szCs w:val="18"/>
+        </w:rPr>
+        <w:t xml:space="preserve">: Cloud -&gt; Platform: GitHub -&gt; Account: </w:t>
+      </w:r>
+      <w:proofErr w:type="spellStart"/>
+      <w:r>
+        <w:rPr>
+          <w:bCs/>
+          <w:sz w:val="18"/>
+          <w:szCs w:val="18"/>
+        </w:rPr>
+        <w:t>animekingdomelbaf</w:t>
+      </w:r>
+      <w:proofErr w:type="spellEnd"/>
+      <w:r>
+        <w:rPr>
+          <w:bCs/>
+          <w:sz w:val="18"/>
+          <w:szCs w:val="18"/>
+        </w:rPr>
+        <w:t xml:space="preserve"> -&gt; Repository: </w:t>
+      </w:r>
+      <w:proofErr w:type="spellStart"/>
+      <w:r>
+        <w:rPr>
+          <w:bCs/>
+          <w:sz w:val="18"/>
+          <w:szCs w:val="18"/>
+        </w:rPr>
+        <w:t>kingdomheartsManga</w:t>
+      </w:r>
+      <w:proofErr w:type="spellEnd"/>
+      <w:r>
+        <w:rPr>
+          <w:bCs/>
+          <w:sz w:val="18"/>
+          <w:szCs w:val="18"/>
+        </w:rPr>
+        <w:t xml:space="preserve"> -&gt; File: Manga/Pupa/..</w:t>
       </w:r>
     </w:p>
     <w:p>
@@ -984,13 +1103,23 @@
         </w:rPr>
         <w:t xml:space="preserve"> </w:t>
       </w:r>
-      <w:r>
-        <w:rPr>
-          <w:bCs/>
-          <w:sz w:val="18"/>
-          <w:szCs w:val="18"/>
-        </w:rPr>
-        <w:t>MangaDex (https://mangadex.org)</w:t>
+      <w:proofErr w:type="spellStart"/>
+      <w:r>
+        <w:rPr>
+          <w:bCs/>
+          <w:sz w:val="18"/>
+          <w:szCs w:val="18"/>
+        </w:rPr>
+        <w:t>MangaDex</w:t>
+      </w:r>
+      <w:proofErr w:type="spellEnd"/>
+      <w:r>
+        <w:rPr>
+          <w:bCs/>
+          <w:sz w:val="18"/>
+          <w:szCs w:val="18"/>
+        </w:rPr>
+        <w:t xml:space="preserve"> (https://mangadex.org)</w:t>
       </w:r>
     </w:p>
     <w:p>
@@ -1024,7 +1153,34 @@
         </w:rPr>
         <w:t xml:space="preserve"> </w:t>
       </w:r>
-      <w:hyperlink r:id="rId9" w:history="1">
+      <w:hyperlink r:id="rId10" w:history="1">
+        <w:r>
+          <w:rPr>
+            <w:rStyle w:val="Hyperlink"/>
+            <w:bCs/>
+            <w:sz w:val="18"/>
+            <w:szCs w:val="18"/>
+          </w:rPr>
+          <w:t>https://mangadex.org/title/f4f3c1b5-a16e-4eca-9bc9-7a9c373a6370/pupa?tab=chapters</w:t>
+        </w:r>
+      </w:hyperlink>
+      <w:r>
+        <w:rPr>
+          <w:bCs/>
+          <w:sz w:val="18"/>
+          <w:szCs w:val="18"/>
+        </w:rPr>
+        <w:t xml:space="preserve"> -&gt;</w:t>
+      </w:r>
+      <w:r>
+        <w:rPr>
+          <w:b/>
+          <w:sz w:val="18"/>
+          <w:szCs w:val="18"/>
+        </w:rPr>
+        <w:t xml:space="preserve"> </w:t>
+      </w:r>
+      <w:hyperlink r:id="rId11" w:history="1">
         <w:r>
           <w:rPr>
             <w:rStyle w:val="Hyperlink"/>
@@ -1081,7 +1237,43 @@
           <w:sz w:val="18"/>
           <w:szCs w:val="18"/>
         </w:rPr>
-        <w:t>https://mangadex.org [MangaDex Server] -&gt; [JManga (Ex-Licenses) User]</w:t>
+        <w:t>https://mangadex.org [</w:t>
+      </w:r>
+      <w:proofErr w:type="spellStart"/>
+      <w:r>
+        <w:rPr>
+          <w:bCs/>
+          <w:sz w:val="18"/>
+          <w:szCs w:val="18"/>
+        </w:rPr>
+        <w:t>MangaDex</w:t>
+      </w:r>
+      <w:proofErr w:type="spellEnd"/>
+      <w:r>
+        <w:rPr>
+          <w:bCs/>
+          <w:sz w:val="18"/>
+          <w:szCs w:val="18"/>
+        </w:rPr>
+        <w:t xml:space="preserve"> Server] -&gt; [</w:t>
+      </w:r>
+      <w:proofErr w:type="spellStart"/>
+      <w:r>
+        <w:rPr>
+          <w:bCs/>
+          <w:sz w:val="18"/>
+          <w:szCs w:val="18"/>
+        </w:rPr>
+        <w:t>JManga</w:t>
+      </w:r>
+      <w:proofErr w:type="spellEnd"/>
+      <w:r>
+        <w:rPr>
+          <w:bCs/>
+          <w:sz w:val="18"/>
+          <w:szCs w:val="18"/>
+        </w:rPr>
+        <w:t xml:space="preserve"> (Ex-Licenses) User]</w:t>
       </w:r>
     </w:p>
     <w:p>
@@ -1211,7 +1403,7 @@
         </w:rPr>
         <w:t>(</w:t>
       </w:r>
-      <w:hyperlink r:id="rId10" w:history="1">
+      <w:hyperlink r:id="rId12" w:history="1">
         <w:r>
           <w:rPr>
             <w:rStyle w:val="Hyperlink"/>
@@ -1254,7 +1446,7 @@
         </w:rPr>
         <w:t xml:space="preserve"> (</w:t>
       </w:r>
-      <w:hyperlink r:id="rId11" w:history="1">
+      <w:hyperlink r:id="rId13" w:history="1">
         <w:r>
           <w:rPr>
             <w:rStyle w:val="Hyperlink"/>
@@ -1521,13 +1713,59 @@
         </w:rPr>
         <w:t xml:space="preserve"> </w:t>
       </w:r>
-      <w:r>
-        <w:rPr>
-          <w:bCs/>
-          <w:sz w:val="18"/>
-          <w:szCs w:val="18"/>
-        </w:rPr>
-        <w:t>StorageType: Cloud -&gt; Platform: GitHub -&gt; Account: animekingdomelbaf -&gt; Repository: kingdomheartsManga -&gt; File: Manga/Pupa/..</w:t>
+      <w:proofErr w:type="spellStart"/>
+      <w:r>
+        <w:rPr>
+          <w:bCs/>
+          <w:sz w:val="18"/>
+          <w:szCs w:val="18"/>
+        </w:rPr>
+        <w:t>StorageType</w:t>
+      </w:r>
+      <w:proofErr w:type="spellEnd"/>
+      <w:r>
+        <w:rPr>
+          <w:bCs/>
+          <w:sz w:val="18"/>
+          <w:szCs w:val="18"/>
+        </w:rPr>
+        <w:t xml:space="preserve">: Cloud -&gt; Platform: GitHub -&gt; Account: </w:t>
+      </w:r>
+      <w:proofErr w:type="spellStart"/>
+      <w:r>
+        <w:rPr>
+          <w:bCs/>
+          <w:sz w:val="18"/>
+          <w:szCs w:val="18"/>
+        </w:rPr>
+        <w:t>animekingdomelbaf</w:t>
+      </w:r>
+      <w:proofErr w:type="spellEnd"/>
+      <w:r>
+        <w:rPr>
+          <w:bCs/>
+          <w:sz w:val="18"/>
+          <w:szCs w:val="18"/>
+        </w:rPr>
+        <w:t xml:space="preserve"> -&gt; Repository: </w:t>
+      </w:r>
+      <w:proofErr w:type="spellStart"/>
+      <w:r>
+        <w:rPr>
+          <w:bCs/>
+          <w:sz w:val="18"/>
+          <w:szCs w:val="18"/>
+        </w:rPr>
+        <w:t>kingdomheartsManga</w:t>
+      </w:r>
+      <w:proofErr w:type="spellEnd"/>
+      <w:r>
+        <w:rPr>
+          <w:bCs/>
+          <w:sz w:val="18"/>
+          <w:szCs w:val="18"/>
+        </w:rPr>
+        <w:t xml:space="preserve"> -&gt; File: Manga/Pupa/..</w:t>
       </w:r>
     </w:p>
     <w:p>
@@ -1741,13 +1979,23 @@
         </w:rPr>
         <w:t xml:space="preserve"> </w:t>
       </w:r>
-      <w:r>
-        <w:rPr>
-          <w:bCs/>
-          <w:sz w:val="18"/>
-          <w:szCs w:val="18"/>
-        </w:rPr>
-        <w:t>MangaDex (https://mangadex.org)</w:t>
+      <w:proofErr w:type="spellStart"/>
+      <w:r>
+        <w:rPr>
+          <w:bCs/>
+          <w:sz w:val="18"/>
+          <w:szCs w:val="18"/>
+        </w:rPr>
+        <w:t>MangaDex</w:t>
+      </w:r>
+      <w:proofErr w:type="spellEnd"/>
+      <w:r>
+        <w:rPr>
+          <w:bCs/>
+          <w:sz w:val="18"/>
+          <w:szCs w:val="18"/>
+        </w:rPr>
+        <w:t xml:space="preserve"> (https://mangadex.org)</w:t>
       </w:r>
     </w:p>
     <w:p>
@@ -1781,7 +2029,34 @@
         </w:rPr>
         <w:t xml:space="preserve"> </w:t>
       </w:r>
-      <w:hyperlink r:id="rId12" w:history="1">
+      <w:hyperlink r:id="rId14" w:history="1">
+        <w:r>
+          <w:rPr>
+            <w:rStyle w:val="Hyperlink"/>
+            <w:bCs/>
+            <w:sz w:val="18"/>
+            <w:szCs w:val="18"/>
+          </w:rPr>
+          <w:t>https://mangadex.org/title/f4f3c1b5-a16e-4eca-9bc9-7a9c373a6370/pupa?tab=chapters</w:t>
+        </w:r>
+      </w:hyperlink>
+      <w:r>
+        <w:rPr>
+          <w:bCs/>
+          <w:sz w:val="18"/>
+          <w:szCs w:val="18"/>
+        </w:rPr>
+        <w:t xml:space="preserve"> -&gt;</w:t>
+      </w:r>
+      <w:r>
+        <w:rPr>
+          <w:b/>
+          <w:sz w:val="18"/>
+          <w:szCs w:val="18"/>
+        </w:rPr>
+        <w:t xml:space="preserve"> </w:t>
+      </w:r>
+      <w:hyperlink r:id="rId15" w:history="1">
         <w:r>
           <w:rPr>
             <w:rStyle w:val="Hyperlink"/>
@@ -1838,784 +2113,43 @@
           <w:sz w:val="18"/>
           <w:szCs w:val="18"/>
         </w:rPr>
-        <w:t>https://mangadex.org [MangaDex Server] -&gt; [JManga (Ex-Licenses) User]</w:t>
-      </w:r>
-    </w:p>
-    <w:p>
-      <w:pPr>
-        <w:ind w:left="720"/>
-        <w:rPr>
-          <w:sz w:val="18"/>
-          <w:szCs w:val="18"/>
-        </w:rPr>
-      </w:pPr>
-      <w:r>
-        <w:rPr>
-          <w:sz w:val="18"/>
-          <w:szCs w:val="18"/>
-        </w:rPr>
-        <w:t>*</w:t>
-      </w:r>
-      <w:r>
-        <w:rPr>
-          <w:b/>
-          <w:sz w:val="18"/>
-          <w:szCs w:val="18"/>
-        </w:rPr>
-        <w:t xml:space="preserve"> Source Nature:</w:t>
-      </w:r>
-      <w:r>
-        <w:rPr>
-          <w:b/>
-          <w:sz w:val="18"/>
-          <w:szCs w:val="18"/>
-        </w:rPr>
-        <w:t xml:space="preserve"> </w:t>
-      </w:r>
-      <w:r>
-        <w:rPr>
-          <w:bCs/>
-          <w:sz w:val="18"/>
-          <w:szCs w:val="18"/>
-        </w:rPr>
-        <w:t>Digital</w:t>
-      </w:r>
-    </w:p>
-    <w:p>
-      <w:pPr>
-        <w:ind w:left="720"/>
-        <w:rPr>
-          <w:sz w:val="18"/>
-          <w:szCs w:val="18"/>
-        </w:rPr>
-      </w:pPr>
-      <w:r>
-        <w:rPr>
-          <w:sz w:val="18"/>
-          <w:szCs w:val="18"/>
-        </w:rPr>
-        <w:t>*</w:t>
-      </w:r>
-      <w:r>
-        <w:rPr>
-          <w:b/>
-          <w:sz w:val="18"/>
-          <w:szCs w:val="18"/>
-        </w:rPr>
-        <w:t xml:space="preserve"> Content Derivation Type:</w:t>
-      </w:r>
-      <w:r>
-        <w:rPr>
-          <w:b/>
-          <w:sz w:val="18"/>
-          <w:szCs w:val="18"/>
-        </w:rPr>
-        <w:t xml:space="preserve"> </w:t>
-      </w:r>
-      <w:r>
-        <w:rPr>
-          <w:bCs/>
-          <w:sz w:val="18"/>
-          <w:szCs w:val="18"/>
-        </w:rPr>
-        <w:t>Downloaded/Collected/Converted</w:t>
-      </w:r>
-    </w:p>
-    <w:p>
-      <w:pPr>
-        <w:ind w:left="720"/>
-        <w:rPr>
-          <w:sz w:val="18"/>
-          <w:szCs w:val="18"/>
-        </w:rPr>
-      </w:pPr>
-      <w:r>
-        <w:rPr>
-          <w:sz w:val="18"/>
-          <w:szCs w:val="18"/>
-        </w:rPr>
-        <w:t>*</w:t>
-      </w:r>
-      <w:r>
-        <w:rPr>
-          <w:b/>
-          <w:sz w:val="18"/>
-          <w:szCs w:val="18"/>
-        </w:rPr>
-        <w:t xml:space="preserve"> Content Acquisition Method:</w:t>
-      </w:r>
-      <w:r>
-        <w:rPr>
-          <w:b/>
-          <w:sz w:val="18"/>
-          <w:szCs w:val="18"/>
-        </w:rPr>
-        <w:t xml:space="preserve"> </w:t>
-      </w:r>
-      <w:r>
-        <w:rPr>
-          <w:bCs/>
-          <w:sz w:val="18"/>
-          <w:szCs w:val="18"/>
-        </w:rPr>
-        <w:t xml:space="preserve">Browser Extension: Image Downloader </w:t>
-      </w:r>
-      <w:r>
-        <w:rPr>
-          <w:bCs/>
-          <w:sz w:val="18"/>
-          <w:szCs w:val="18"/>
-        </w:rPr>
-        <w:t>(</w:t>
-      </w:r>
-      <w:hyperlink r:id="rId13" w:history="1">
-        <w:r>
-          <w:rPr>
-            <w:rStyle w:val="Hyperlink"/>
-            <w:bCs/>
-            <w:sz w:val="18"/>
-            <w:szCs w:val="18"/>
-          </w:rPr>
-          <w:t>https://chromewebstore.google.com/detail/image-downloader/cnpniohnfphhjihaiiggeabnkjhpaldj?pli=1</w:t>
-        </w:r>
-      </w:hyperlink>
-      <w:r>
-        <w:rPr>
-          <w:bCs/>
-          <w:sz w:val="18"/>
-          <w:szCs w:val="18"/>
-        </w:rPr>
-        <w:t>)</w:t>
-      </w:r>
-      <w:r>
-        <w:rPr>
-          <w:bCs/>
-          <w:sz w:val="18"/>
-          <w:szCs w:val="18"/>
-        </w:rPr>
-        <w:t xml:space="preserve"> </w:t>
-      </w:r>
-      <w:r>
-        <w:rPr>
-          <w:bCs/>
-          <w:sz w:val="18"/>
-          <w:szCs w:val="18"/>
-        </w:rPr>
-        <w:t>[Used to download all images from the chapter] -&gt; Application: Adobe Acrobat</w:t>
-      </w:r>
-      <w:r>
-        <w:rPr>
-          <w:bCs/>
-          <w:sz w:val="18"/>
-          <w:szCs w:val="18"/>
-        </w:rPr>
-        <w:t xml:space="preserve"> (</w:t>
-      </w:r>
-      <w:hyperlink r:id="rId14" w:history="1">
-        <w:r>
-          <w:rPr>
-            <w:rStyle w:val="Hyperlink"/>
-            <w:bCs/>
-            <w:sz w:val="18"/>
-            <w:szCs w:val="18"/>
-          </w:rPr>
-          <w:t>https://get.adobe.com/reader/</w:t>
-        </w:r>
-      </w:hyperlink>
-      <w:r>
-        <w:rPr>
-          <w:bCs/>
-          <w:sz w:val="18"/>
-          <w:szCs w:val="18"/>
-        </w:rPr>
-        <w:t>)</w:t>
-      </w:r>
-      <w:r>
-        <w:rPr>
-          <w:bCs/>
-          <w:sz w:val="18"/>
-          <w:szCs w:val="18"/>
-        </w:rPr>
-        <w:t xml:space="preserve"> [Used to combine downloaded images into a single PDF document]</w:t>
-      </w:r>
-    </w:p>
-    <w:p>
-      <w:pPr>
-        <w:ind w:left="720"/>
-        <w:rPr>
-          <w:sz w:val="18"/>
-          <w:szCs w:val="18"/>
-        </w:rPr>
-      </w:pPr>
-      <w:r>
-        <w:rPr>
-          <w:sz w:val="18"/>
-          <w:szCs w:val="18"/>
-        </w:rPr>
-        <w:t>*</w:t>
-      </w:r>
-      <w:r>
-        <w:rPr>
-          <w:b/>
-          <w:sz w:val="18"/>
-          <w:szCs w:val="18"/>
-        </w:rPr>
-        <w:t xml:space="preserve"> Content Acquisition Date:</w:t>
-      </w:r>
-      <w:r>
-        <w:rPr>
-          <w:b/>
-          <w:sz w:val="18"/>
-          <w:szCs w:val="18"/>
-        </w:rPr>
-        <w:t xml:space="preserve"> </w:t>
-      </w:r>
-      <w:r>
-        <w:rPr>
-          <w:bCs/>
-          <w:sz w:val="18"/>
-          <w:szCs w:val="18"/>
-        </w:rPr>
-        <w:t>10/31/2025</w:t>
-      </w:r>
-    </w:p>
-    <w:p>
-      <w:pPr>
-        <w:ind w:left="720"/>
-        <w:rPr>
-          <w:sz w:val="18"/>
-          <w:szCs w:val="18"/>
-        </w:rPr>
-      </w:pPr>
-      <w:r>
-        <w:rPr>
-          <w:sz w:val="18"/>
-          <w:szCs w:val="18"/>
-        </w:rPr>
-        <w:t>*</w:t>
-      </w:r>
-      <w:r>
-        <w:rPr>
-          <w:b/>
-          <w:sz w:val="18"/>
-          <w:szCs w:val="18"/>
-        </w:rPr>
-        <w:t xml:space="preserve"> Content File Format:</w:t>
-      </w:r>
-      <w:r>
-        <w:rPr>
-          <w:b/>
-          <w:sz w:val="18"/>
-          <w:szCs w:val="18"/>
-        </w:rPr>
-        <w:t xml:space="preserve"> </w:t>
-      </w:r>
-      <w:r>
-        <w:rPr>
-          <w:bCs/>
-          <w:sz w:val="18"/>
-          <w:szCs w:val="18"/>
-        </w:rPr>
-        <w:t>.pdf</w:t>
-      </w:r>
-    </w:p>
-    <w:p>
-      <w:pPr>
-        <w:ind w:left="720"/>
-        <w:rPr>
-          <w:sz w:val="18"/>
-          <w:szCs w:val="18"/>
-        </w:rPr>
-      </w:pPr>
-      <w:r>
-        <w:rPr>
-          <w:sz w:val="18"/>
-          <w:szCs w:val="18"/>
-        </w:rPr>
-        <w:t>*</w:t>
-      </w:r>
-      <w:r>
-        <w:rPr>
-          <w:b/>
-          <w:sz w:val="18"/>
-          <w:szCs w:val="18"/>
-        </w:rPr>
-        <w:t xml:space="preserve"> Content Size:</w:t>
-      </w:r>
-      <w:r>
-        <w:rPr>
-          <w:b/>
-          <w:sz w:val="18"/>
-          <w:szCs w:val="18"/>
-        </w:rPr>
-        <w:t xml:space="preserve"> </w:t>
-      </w:r>
-      <w:r>
-        <w:rPr>
-          <w:bCs/>
-          <w:sz w:val="18"/>
-          <w:szCs w:val="18"/>
-        </w:rPr>
-        <w:t>9</w:t>
-      </w:r>
-      <w:r>
-        <w:rPr>
-          <w:bCs/>
-          <w:sz w:val="18"/>
-          <w:szCs w:val="18"/>
-        </w:rPr>
-        <w:t>.</w:t>
-      </w:r>
-      <w:r>
-        <w:rPr>
-          <w:bCs/>
-          <w:sz w:val="18"/>
-          <w:szCs w:val="18"/>
-        </w:rPr>
-        <w:t>37</w:t>
-      </w:r>
-      <w:r>
-        <w:rPr>
-          <w:bCs/>
-          <w:sz w:val="18"/>
-          <w:szCs w:val="18"/>
-        </w:rPr>
-        <w:t xml:space="preserve"> MB</w:t>
-      </w:r>
-    </w:p>
-    <w:p>
-      <w:pPr>
-        <w:ind w:left="720"/>
-        <w:rPr>
-          <w:sz w:val="18"/>
-          <w:szCs w:val="18"/>
-        </w:rPr>
-      </w:pPr>
-      <w:r>
-        <w:rPr>
-          <w:sz w:val="18"/>
-          <w:szCs w:val="18"/>
-        </w:rPr>
-        <w:t>*</w:t>
-      </w:r>
-      <w:r>
-        <w:rPr>
-          <w:b/>
-          <w:sz w:val="18"/>
-          <w:szCs w:val="18"/>
-        </w:rPr>
-        <w:t xml:space="preserve"> Content Attributes:</w:t>
-      </w:r>
-      <w:r>
-        <w:rPr>
-          <w:b/>
-          <w:sz w:val="18"/>
-          <w:szCs w:val="18"/>
-        </w:rPr>
-        <w:t xml:space="preserve"> </w:t>
-      </w:r>
-      <w:r>
-        <w:rPr>
-          <w:bCs/>
-          <w:sz w:val="18"/>
-          <w:szCs w:val="18"/>
-        </w:rPr>
-        <w:t xml:space="preserve">Scan Quality: </w:t>
-      </w:r>
-      <w:r>
-        <w:rPr>
-          <w:bCs/>
-          <w:sz w:val="18"/>
-          <w:szCs w:val="18"/>
-        </w:rPr>
-        <w:t>High</w:t>
-      </w:r>
-      <w:r>
-        <w:rPr>
-          <w:bCs/>
-          <w:sz w:val="18"/>
-          <w:szCs w:val="18"/>
-        </w:rPr>
-        <w:t xml:space="preserve">, Pages Number: </w:t>
-      </w:r>
-      <w:r>
-        <w:rPr>
-          <w:bCs/>
-          <w:sz w:val="18"/>
-          <w:szCs w:val="18"/>
-        </w:rPr>
-        <w:t>30</w:t>
-      </w:r>
-    </w:p>
-    <w:p>
-      <w:pPr>
-        <w:ind w:left="720"/>
-        <w:rPr>
-          <w:sz w:val="18"/>
-          <w:szCs w:val="18"/>
-        </w:rPr>
-      </w:pPr>
-      <w:r>
-        <w:rPr>
-          <w:sz w:val="18"/>
-          <w:szCs w:val="18"/>
-        </w:rPr>
-        <w:t>*</w:t>
-      </w:r>
-      <w:r>
-        <w:rPr>
-          <w:b/>
-          <w:sz w:val="18"/>
-          <w:szCs w:val="18"/>
-        </w:rPr>
-        <w:t xml:space="preserve"> Storage Location:</w:t>
-      </w:r>
-      <w:r>
-        <w:rPr>
-          <w:b/>
-          <w:sz w:val="18"/>
-          <w:szCs w:val="18"/>
-        </w:rPr>
-        <w:t xml:space="preserve"> </w:t>
-      </w:r>
-      <w:r>
-        <w:rPr>
-          <w:bCs/>
-          <w:sz w:val="18"/>
-          <w:szCs w:val="18"/>
-        </w:rPr>
-        <w:t>StorageType: Cloud -&gt; Platform: GitHub -&gt; Account: animekingdomelbaf -&gt; Repository: kingdomheartsManga -&gt; File: Manga/Pupa/..</w:t>
-      </w:r>
-    </w:p>
-    <w:p>
-      <w:pPr>
-        <w:ind w:left="720"/>
-        <w:rPr>
-          <w:sz w:val="18"/>
-          <w:szCs w:val="18"/>
-        </w:rPr>
-      </w:pPr>
-      <w:r>
-        <w:rPr>
-          <w:sz w:val="18"/>
-          <w:szCs w:val="18"/>
-        </w:rPr>
-        <w:t>*</w:t>
-      </w:r>
-      <w:r>
-        <w:rPr>
-          <w:b/>
-          <w:sz w:val="18"/>
-          <w:szCs w:val="18"/>
-        </w:rPr>
-        <w:t xml:space="preserve"> Notes:</w:t>
-      </w:r>
-      <w:r>
-        <w:rPr>
-          <w:b/>
-          <w:sz w:val="18"/>
-          <w:szCs w:val="18"/>
-        </w:rPr>
-        <w:t xml:space="preserve"> </w:t>
-      </w:r>
-    </w:p>
-    <w:p>
-      <w:pPr>
-        <w:ind w:left="720" w:hanging="360"/>
-      </w:pPr>
-    </w:p>
-    <w:p>
-      <w:pPr>
-        <w:ind w:left="720" w:hanging="360"/>
-      </w:pPr>
-    </w:p>
-    <w:p>
-      <w:pPr>
-        <w:pStyle w:val="ListParagraph"/>
-        <w:numPr>
-          <w:ilvl w:val="0"/>
-          <w:numId w:val="4"/>
-        </w:numPr>
-        <w:rPr>
-          <w:sz w:val="18"/>
-          <w:szCs w:val="18"/>
-        </w:rPr>
-      </w:pPr>
-      <w:r>
-        <w:rPr>
-          <w:bCs/>
-          <w:sz w:val="18"/>
-          <w:szCs w:val="18"/>
-        </w:rPr>
-        <w:t>*</w:t>
-      </w:r>
-      <w:r>
-        <w:rPr>
-          <w:b/>
-          <w:sz w:val="18"/>
-          <w:szCs w:val="18"/>
-        </w:rPr>
-        <w:t xml:space="preserve"> </w:t>
-      </w:r>
-      <w:r>
-        <w:rPr>
-          <w:b/>
-          <w:sz w:val="18"/>
-          <w:szCs w:val="18"/>
-        </w:rPr>
-        <w:t xml:space="preserve">ID: </w:t>
-      </w:r>
-      <w:r>
-        <w:rPr>
-          <w:bCs/>
-          <w:sz w:val="18"/>
-          <w:szCs w:val="18"/>
-        </w:rPr>
-        <w:t>257</w:t>
-      </w:r>
-      <w:r>
-        <w:rPr>
-          <w:sz w:val="18"/>
-          <w:szCs w:val="18"/>
-        </w:rPr>
-        <w:br/>
-        <w:t>*</w:t>
-      </w:r>
-      <w:r>
-        <w:rPr>
-          <w:b/>
-          <w:sz w:val="18"/>
-          <w:szCs w:val="18"/>
-        </w:rPr>
-        <w:t xml:space="preserve"> </w:t>
-      </w:r>
-      <w:r>
-        <w:rPr>
-          <w:b/>
-          <w:sz w:val="18"/>
-          <w:szCs w:val="18"/>
-        </w:rPr>
-        <w:t xml:space="preserve">Content </w:t>
-      </w:r>
-      <w:r>
-        <w:rPr>
-          <w:b/>
-          <w:sz w:val="18"/>
-          <w:szCs w:val="18"/>
-        </w:rPr>
-        <w:t xml:space="preserve">Title: </w:t>
-      </w:r>
-      <w:r>
-        <w:rPr>
-          <w:bCs/>
-          <w:sz w:val="18"/>
-          <w:szCs w:val="18"/>
-        </w:rPr>
-        <w:t>[Peeping Tomcat.pdf] [Pupa - Volume 1 - 4-Peeping Tomcat]</w:t>
-      </w:r>
-    </w:p>
-    <w:p>
-      <w:pPr>
-        <w:pStyle w:val="ListParagraph"/>
-        <w:rPr>
-          <w:sz w:val="18"/>
-          <w:szCs w:val="18"/>
-        </w:rPr>
-      </w:pPr>
-      <w:r>
-        <w:rPr>
-          <w:sz w:val="18"/>
-          <w:szCs w:val="18"/>
-        </w:rPr>
-        <w:t>*</w:t>
-      </w:r>
-      <w:r>
-        <w:rPr>
-          <w:b/>
-          <w:sz w:val="18"/>
-          <w:szCs w:val="18"/>
-        </w:rPr>
-        <w:t xml:space="preserve"> Content Type: </w:t>
-      </w:r>
-      <w:r>
-        <w:rPr>
-          <w:bCs/>
-          <w:sz w:val="18"/>
-          <w:szCs w:val="18"/>
-        </w:rPr>
-        <w:t>Document</w:t>
-      </w:r>
-    </w:p>
-    <w:p>
-      <w:pPr>
-        <w:ind w:left="720"/>
-        <w:rPr>
-          <w:sz w:val="18"/>
-          <w:szCs w:val="18"/>
-        </w:rPr>
-      </w:pPr>
-      <w:r>
-        <w:rPr>
-          <w:sz w:val="18"/>
-          <w:szCs w:val="18"/>
-        </w:rPr>
-        <w:t>*</w:t>
-      </w:r>
-      <w:r>
-        <w:rPr>
-          <w:b/>
-          <w:sz w:val="18"/>
-          <w:szCs w:val="18"/>
-        </w:rPr>
-        <w:t xml:space="preserve"> Content Domain:</w:t>
-      </w:r>
-      <w:r>
-        <w:rPr>
-          <w:b/>
-          <w:sz w:val="18"/>
-          <w:szCs w:val="18"/>
-        </w:rPr>
-        <w:t xml:space="preserve"> </w:t>
-      </w:r>
-      <w:r>
-        <w:rPr>
-          <w:bCs/>
-          <w:sz w:val="18"/>
-          <w:szCs w:val="18"/>
-        </w:rPr>
-        <w:t>Entertainment</w:t>
-      </w:r>
-    </w:p>
-    <w:p>
-      <w:pPr>
-        <w:ind w:left="720"/>
-        <w:rPr>
-          <w:sz w:val="18"/>
-          <w:szCs w:val="18"/>
-          <w:lang w:val="en-US"/>
-        </w:rPr>
-      </w:pPr>
-      <w:r>
-        <w:rPr>
-          <w:sz w:val="18"/>
-          <w:szCs w:val="18"/>
-        </w:rPr>
-        <w:t>*</w:t>
-      </w:r>
-      <w:r>
-        <w:rPr>
-          <w:b/>
-          <w:sz w:val="18"/>
-          <w:szCs w:val="18"/>
-        </w:rPr>
-        <w:t xml:space="preserve"> Source Platform:</w:t>
-      </w:r>
-      <w:r>
-        <w:rPr>
-          <w:b/>
-          <w:sz w:val="18"/>
-          <w:szCs w:val="18"/>
-        </w:rPr>
-        <w:t xml:space="preserve"> </w:t>
-      </w:r>
-      <w:r>
-        <w:rPr>
-          <w:bCs/>
-          <w:sz w:val="18"/>
-          <w:szCs w:val="18"/>
-        </w:rPr>
-        <w:t>MangaDex (https://mangadex.org)</w:t>
-      </w:r>
-    </w:p>
-    <w:p>
-      <w:pPr>
-        <w:ind w:left="720"/>
-        <w:rPr>
-          <w:sz w:val="18"/>
-          <w:szCs w:val="18"/>
-        </w:rPr>
-      </w:pPr>
-      <w:r>
-        <w:rPr>
-          <w:sz w:val="18"/>
-          <w:szCs w:val="18"/>
-        </w:rPr>
-        <w:t>*</w:t>
-      </w:r>
-      <w:r>
-        <w:rPr>
-          <w:b/>
-          <w:sz w:val="18"/>
-          <w:szCs w:val="18"/>
-        </w:rPr>
-        <w:t xml:space="preserve"> Source Reference:</w:t>
-      </w:r>
-      <w:r>
-        <w:rPr>
-          <w:b/>
-          <w:sz w:val="18"/>
-          <w:szCs w:val="18"/>
-        </w:rPr>
-        <w:t xml:space="preserve"> </w:t>
-      </w:r>
-      <w:hyperlink r:id="rId15" w:history="1">
-        <w:r>
-          <w:rPr>
-            <w:rStyle w:val="Hyperlink"/>
-            <w:bCs/>
-            <w:sz w:val="18"/>
-            <w:szCs w:val="18"/>
-          </w:rPr>
-          <w:t>https://mangadex.org/chapter/44d16448-3284-40e0-a2e6-65ee0b508545</w:t>
-        </w:r>
-      </w:hyperlink>
-      <w:r>
-        <w:rPr>
-          <w:bCs/>
-          <w:sz w:val="18"/>
-          <w:szCs w:val="18"/>
-        </w:rPr>
-        <w:t xml:space="preserve"> </w:t>
-      </w:r>
-    </w:p>
-    <w:p>
-      <w:pPr>
-        <w:ind w:left="720"/>
-        <w:rPr>
-          <w:sz w:val="18"/>
-          <w:szCs w:val="18"/>
-        </w:rPr>
-      </w:pPr>
-      <w:r>
-        <w:rPr>
-          <w:sz w:val="18"/>
-          <w:szCs w:val="18"/>
-        </w:rPr>
-        <w:t>*</w:t>
-      </w:r>
-      <w:r>
-        <w:rPr>
-          <w:b/>
-          <w:sz w:val="18"/>
-          <w:szCs w:val="18"/>
-        </w:rPr>
-        <w:t xml:space="preserve"> Source Storage Host:</w:t>
-      </w:r>
-      <w:r>
-        <w:rPr>
-          <w:b/>
-          <w:sz w:val="18"/>
-          <w:szCs w:val="18"/>
-        </w:rPr>
-        <w:t xml:space="preserve"> </w:t>
-      </w:r>
-      <w:r>
-        <w:rPr>
-          <w:bCs/>
-          <w:sz w:val="18"/>
-          <w:szCs w:val="18"/>
-        </w:rPr>
-        <w:t>https://mangadex.org [MangaDex Server] -&gt; [JManga (Ex-Licenses) User]</w:t>
+        <w:t>https://mangadex.org [</w:t>
+      </w:r>
+      <w:proofErr w:type="spellStart"/>
+      <w:r>
+        <w:rPr>
+          <w:bCs/>
+          <w:sz w:val="18"/>
+          <w:szCs w:val="18"/>
+        </w:rPr>
+        <w:t>MangaDex</w:t>
+      </w:r>
+      <w:proofErr w:type="spellEnd"/>
+      <w:r>
+        <w:rPr>
+          <w:bCs/>
+          <w:sz w:val="18"/>
+          <w:szCs w:val="18"/>
+        </w:rPr>
+        <w:t xml:space="preserve"> Server] -&gt; [</w:t>
+      </w:r>
+      <w:proofErr w:type="spellStart"/>
+      <w:r>
+        <w:rPr>
+          <w:bCs/>
+          <w:sz w:val="18"/>
+          <w:szCs w:val="18"/>
+        </w:rPr>
+        <w:t>JManga</w:t>
+      </w:r>
+      <w:proofErr w:type="spellEnd"/>
+      <w:r>
+        <w:rPr>
+          <w:bCs/>
+          <w:sz w:val="18"/>
+          <w:szCs w:val="18"/>
+        </w:rPr>
+        <w:t xml:space="preserve"> (Ex-Licenses) User]</w:t>
       </w:r>
     </w:p>
     <w:p>
@@ -2933,23 +2467,31 @@
           <w:sz w:val="18"/>
           <w:szCs w:val="18"/>
         </w:rPr>
-        <w:t>9.</w:t>
-      </w:r>
-      <w:r>
-        <w:rPr>
-          <w:bCs/>
-          <w:sz w:val="18"/>
-          <w:szCs w:val="18"/>
-        </w:rPr>
-        <w:t xml:space="preserve">53 </w:t>
-      </w:r>
-      <w:r>
-        <w:rPr>
-          <w:bCs/>
-          <w:sz w:val="18"/>
-          <w:szCs w:val="18"/>
-        </w:rPr>
-        <w:t>MB</w:t>
+        <w:t>9</w:t>
+      </w:r>
+      <w:r>
+        <w:rPr>
+          <w:bCs/>
+          <w:sz w:val="18"/>
+          <w:szCs w:val="18"/>
+        </w:rPr>
+        <w:t>.</w:t>
+      </w:r>
+      <w:r>
+        <w:rPr>
+          <w:bCs/>
+          <w:sz w:val="18"/>
+          <w:szCs w:val="18"/>
+        </w:rPr>
+        <w:t>37</w:t>
+      </w:r>
+      <w:r>
+        <w:rPr>
+          <w:bCs/>
+          <w:sz w:val="18"/>
+          <w:szCs w:val="18"/>
+        </w:rPr>
+        <w:t xml:space="preserve"> MB</w:t>
       </w:r>
     </w:p>
     <w:p>
@@ -3013,7 +2555,7 @@
           <w:sz w:val="18"/>
           <w:szCs w:val="18"/>
         </w:rPr>
-        <w:t>35</w:t>
+        <w:t>30</w:t>
       </w:r>
     </w:p>
     <w:p>
@@ -3047,13 +2589,59 @@
         </w:rPr>
         <w:t xml:space="preserve"> </w:t>
       </w:r>
-      <w:r>
-        <w:rPr>
-          <w:bCs/>
-          <w:sz w:val="18"/>
-          <w:szCs w:val="18"/>
-        </w:rPr>
-        <w:t>StorageType: Cloud -&gt; Platform: GitHub -&gt; Account: animekingdomelbaf -&gt; Repository: kingdomheartsManga -&gt; File: Manga/Pupa/..</w:t>
+      <w:proofErr w:type="spellStart"/>
+      <w:r>
+        <w:rPr>
+          <w:bCs/>
+          <w:sz w:val="18"/>
+          <w:szCs w:val="18"/>
+        </w:rPr>
+        <w:t>StorageType</w:t>
+      </w:r>
+      <w:proofErr w:type="spellEnd"/>
+      <w:r>
+        <w:rPr>
+          <w:bCs/>
+          <w:sz w:val="18"/>
+          <w:szCs w:val="18"/>
+        </w:rPr>
+        <w:t xml:space="preserve">: Cloud -&gt; Platform: GitHub -&gt; Account: </w:t>
+      </w:r>
+      <w:proofErr w:type="spellStart"/>
+      <w:r>
+        <w:rPr>
+          <w:bCs/>
+          <w:sz w:val="18"/>
+          <w:szCs w:val="18"/>
+        </w:rPr>
+        <w:t>animekingdomelbaf</w:t>
+      </w:r>
+      <w:proofErr w:type="spellEnd"/>
+      <w:r>
+        <w:rPr>
+          <w:bCs/>
+          <w:sz w:val="18"/>
+          <w:szCs w:val="18"/>
+        </w:rPr>
+        <w:t xml:space="preserve"> -&gt; Repository: </w:t>
+      </w:r>
+      <w:proofErr w:type="spellStart"/>
+      <w:r>
+        <w:rPr>
+          <w:bCs/>
+          <w:sz w:val="18"/>
+          <w:szCs w:val="18"/>
+        </w:rPr>
+        <w:t>kingdomheartsManga</w:t>
+      </w:r>
+      <w:proofErr w:type="spellEnd"/>
+      <w:r>
+        <w:rPr>
+          <w:bCs/>
+          <w:sz w:val="18"/>
+          <w:szCs w:val="18"/>
+        </w:rPr>
+        <w:t xml:space="preserve"> -&gt; File: Manga/Pupa/..</w:t>
       </w:r>
     </w:p>
     <w:p>
@@ -3089,9 +2677,14 @@
       </w:r>
     </w:p>
     <w:p>
-      <w:r>
-        <w:br w:type="page"/>
-      </w:r>
+      <w:pPr>
+        <w:ind w:left="720" w:hanging="360"/>
+      </w:pPr>
+    </w:p>
+    <w:p>
+      <w:pPr>
+        <w:ind w:left="720" w:hanging="360"/>
+      </w:pPr>
     </w:p>
     <w:p>
       <w:pPr>
@@ -3111,6 +2704,889 @@
           <w:sz w:val="18"/>
           <w:szCs w:val="18"/>
         </w:rPr>
+        <w:t>*</w:t>
+      </w:r>
+      <w:r>
+        <w:rPr>
+          <w:b/>
+          <w:sz w:val="18"/>
+          <w:szCs w:val="18"/>
+        </w:rPr>
+        <w:t xml:space="preserve"> </w:t>
+      </w:r>
+      <w:r>
+        <w:rPr>
+          <w:b/>
+          <w:sz w:val="18"/>
+          <w:szCs w:val="18"/>
+        </w:rPr>
+        <w:t xml:space="preserve">ID: </w:t>
+      </w:r>
+      <w:r>
+        <w:rPr>
+          <w:bCs/>
+          <w:sz w:val="18"/>
+          <w:szCs w:val="18"/>
+        </w:rPr>
+        <w:t>257</w:t>
+      </w:r>
+      <w:r>
+        <w:rPr>
+          <w:sz w:val="18"/>
+          <w:szCs w:val="18"/>
+        </w:rPr>
+        <w:br/>
+        <w:t>*</w:t>
+      </w:r>
+      <w:r>
+        <w:rPr>
+          <w:b/>
+          <w:sz w:val="18"/>
+          <w:szCs w:val="18"/>
+        </w:rPr>
+        <w:t xml:space="preserve"> </w:t>
+      </w:r>
+      <w:r>
+        <w:rPr>
+          <w:b/>
+          <w:sz w:val="18"/>
+          <w:szCs w:val="18"/>
+        </w:rPr>
+        <w:t xml:space="preserve">Content </w:t>
+      </w:r>
+      <w:r>
+        <w:rPr>
+          <w:b/>
+          <w:sz w:val="18"/>
+          <w:szCs w:val="18"/>
+        </w:rPr>
+        <w:t xml:space="preserve">Title: </w:t>
+      </w:r>
+      <w:r>
+        <w:rPr>
+          <w:bCs/>
+          <w:sz w:val="18"/>
+          <w:szCs w:val="18"/>
+        </w:rPr>
+        <w:t>[Peeping Tomcat.pdf] [Pupa - Volume 1 - 4-Peeping Tomcat]</w:t>
+      </w:r>
+    </w:p>
+    <w:p>
+      <w:pPr>
+        <w:pStyle w:val="ListParagraph"/>
+        <w:rPr>
+          <w:sz w:val="18"/>
+          <w:szCs w:val="18"/>
+        </w:rPr>
+      </w:pPr>
+      <w:r>
+        <w:rPr>
+          <w:sz w:val="18"/>
+          <w:szCs w:val="18"/>
+        </w:rPr>
+        <w:t>*</w:t>
+      </w:r>
+      <w:r>
+        <w:rPr>
+          <w:b/>
+          <w:sz w:val="18"/>
+          <w:szCs w:val="18"/>
+        </w:rPr>
+        <w:t xml:space="preserve"> Content Type: </w:t>
+      </w:r>
+      <w:r>
+        <w:rPr>
+          <w:bCs/>
+          <w:sz w:val="18"/>
+          <w:szCs w:val="18"/>
+        </w:rPr>
+        <w:t>Document</w:t>
+      </w:r>
+    </w:p>
+    <w:p>
+      <w:pPr>
+        <w:ind w:left="720"/>
+        <w:rPr>
+          <w:sz w:val="18"/>
+          <w:szCs w:val="18"/>
+        </w:rPr>
+      </w:pPr>
+      <w:r>
+        <w:rPr>
+          <w:sz w:val="18"/>
+          <w:szCs w:val="18"/>
+        </w:rPr>
+        <w:t>*</w:t>
+      </w:r>
+      <w:r>
+        <w:rPr>
+          <w:b/>
+          <w:sz w:val="18"/>
+          <w:szCs w:val="18"/>
+        </w:rPr>
+        <w:t xml:space="preserve"> Content Domain:</w:t>
+      </w:r>
+      <w:r>
+        <w:rPr>
+          <w:b/>
+          <w:sz w:val="18"/>
+          <w:szCs w:val="18"/>
+        </w:rPr>
+        <w:t xml:space="preserve"> </w:t>
+      </w:r>
+      <w:r>
+        <w:rPr>
+          <w:bCs/>
+          <w:sz w:val="18"/>
+          <w:szCs w:val="18"/>
+        </w:rPr>
+        <w:t>Entertainment</w:t>
+      </w:r>
+    </w:p>
+    <w:p>
+      <w:pPr>
+        <w:ind w:left="720"/>
+        <w:rPr>
+          <w:sz w:val="18"/>
+          <w:szCs w:val="18"/>
+          <w:lang w:val="en-US"/>
+        </w:rPr>
+      </w:pPr>
+      <w:r>
+        <w:rPr>
+          <w:sz w:val="18"/>
+          <w:szCs w:val="18"/>
+        </w:rPr>
+        <w:t>*</w:t>
+      </w:r>
+      <w:r>
+        <w:rPr>
+          <w:b/>
+          <w:sz w:val="18"/>
+          <w:szCs w:val="18"/>
+        </w:rPr>
+        <w:t xml:space="preserve"> Source Platform:</w:t>
+      </w:r>
+      <w:r>
+        <w:rPr>
+          <w:b/>
+          <w:sz w:val="18"/>
+          <w:szCs w:val="18"/>
+        </w:rPr>
+        <w:t xml:space="preserve"> </w:t>
+      </w:r>
+      <w:proofErr w:type="spellStart"/>
+      <w:r>
+        <w:rPr>
+          <w:bCs/>
+          <w:sz w:val="18"/>
+          <w:szCs w:val="18"/>
+        </w:rPr>
+        <w:t>MangaDex</w:t>
+      </w:r>
+      <w:proofErr w:type="spellEnd"/>
+      <w:r>
+        <w:rPr>
+          <w:bCs/>
+          <w:sz w:val="18"/>
+          <w:szCs w:val="18"/>
+        </w:rPr>
+        <w:t xml:space="preserve"> (https://mangadex.org)</w:t>
+      </w:r>
+    </w:p>
+    <w:p>
+      <w:pPr>
+        <w:ind w:left="720"/>
+        <w:rPr>
+          <w:sz w:val="18"/>
+          <w:szCs w:val="18"/>
+        </w:rPr>
+      </w:pPr>
+      <w:r>
+        <w:rPr>
+          <w:sz w:val="18"/>
+          <w:szCs w:val="18"/>
+        </w:rPr>
+        <w:t>*</w:t>
+      </w:r>
+      <w:r>
+        <w:rPr>
+          <w:b/>
+          <w:sz w:val="18"/>
+          <w:szCs w:val="18"/>
+        </w:rPr>
+        <w:t xml:space="preserve"> Source Reference:</w:t>
+      </w:r>
+      <w:r>
+        <w:rPr>
+          <w:b/>
+          <w:sz w:val="18"/>
+          <w:szCs w:val="18"/>
+        </w:rPr>
+        <w:t xml:space="preserve"> </w:t>
+      </w:r>
+      <w:hyperlink r:id="rId18" w:history="1">
+        <w:r>
+          <w:rPr>
+            <w:rStyle w:val="Hyperlink"/>
+            <w:bCs/>
+            <w:sz w:val="18"/>
+            <w:szCs w:val="18"/>
+          </w:rPr>
+          <w:t>https://mangadex.org/title/f4f3c1b5-a16e-4eca-9bc9-7a9c373a6370/pupa?tab=chapters</w:t>
+        </w:r>
+      </w:hyperlink>
+      <w:r>
+        <w:rPr>
+          <w:bCs/>
+          <w:sz w:val="18"/>
+          <w:szCs w:val="18"/>
+        </w:rPr>
+        <w:t xml:space="preserve"> -&gt;</w:t>
+      </w:r>
+      <w:r>
+        <w:rPr>
+          <w:b/>
+          <w:sz w:val="18"/>
+          <w:szCs w:val="18"/>
+        </w:rPr>
+        <w:t xml:space="preserve"> </w:t>
+      </w:r>
+      <w:hyperlink r:id="rId19" w:history="1">
+        <w:r>
+          <w:rPr>
+            <w:rStyle w:val="Hyperlink"/>
+            <w:bCs/>
+            <w:sz w:val="18"/>
+            <w:szCs w:val="18"/>
+          </w:rPr>
+          <w:t>https://mangadex.org/chapter/44d16448-3284-40e0-a2e6-65ee0b508545</w:t>
+        </w:r>
+      </w:hyperlink>
+      <w:r>
+        <w:rPr>
+          <w:bCs/>
+          <w:sz w:val="18"/>
+          <w:szCs w:val="18"/>
+        </w:rPr>
+        <w:t xml:space="preserve"> </w:t>
+      </w:r>
+    </w:p>
+    <w:p>
+      <w:pPr>
+        <w:ind w:left="720"/>
+        <w:rPr>
+          <w:sz w:val="18"/>
+          <w:szCs w:val="18"/>
+        </w:rPr>
+      </w:pPr>
+      <w:r>
+        <w:rPr>
+          <w:sz w:val="18"/>
+          <w:szCs w:val="18"/>
+        </w:rPr>
+        <w:t>*</w:t>
+      </w:r>
+      <w:r>
+        <w:rPr>
+          <w:b/>
+          <w:sz w:val="18"/>
+          <w:szCs w:val="18"/>
+        </w:rPr>
+        <w:t xml:space="preserve"> Source Storage Host:</w:t>
+      </w:r>
+      <w:r>
+        <w:rPr>
+          <w:b/>
+          <w:sz w:val="18"/>
+          <w:szCs w:val="18"/>
+        </w:rPr>
+        <w:t xml:space="preserve"> </w:t>
+      </w:r>
+      <w:r>
+        <w:rPr>
+          <w:bCs/>
+          <w:sz w:val="18"/>
+          <w:szCs w:val="18"/>
+        </w:rPr>
+        <w:t>https://mangadex.org [</w:t>
+      </w:r>
+      <w:proofErr w:type="spellStart"/>
+      <w:r>
+        <w:rPr>
+          <w:bCs/>
+          <w:sz w:val="18"/>
+          <w:szCs w:val="18"/>
+        </w:rPr>
+        <w:t>MangaDex</w:t>
+      </w:r>
+      <w:proofErr w:type="spellEnd"/>
+      <w:r>
+        <w:rPr>
+          <w:bCs/>
+          <w:sz w:val="18"/>
+          <w:szCs w:val="18"/>
+        </w:rPr>
+        <w:t xml:space="preserve"> Server] -&gt; [</w:t>
+      </w:r>
+      <w:proofErr w:type="spellStart"/>
+      <w:r>
+        <w:rPr>
+          <w:bCs/>
+          <w:sz w:val="18"/>
+          <w:szCs w:val="18"/>
+        </w:rPr>
+        <w:t>JManga</w:t>
+      </w:r>
+      <w:proofErr w:type="spellEnd"/>
+      <w:r>
+        <w:rPr>
+          <w:bCs/>
+          <w:sz w:val="18"/>
+          <w:szCs w:val="18"/>
+        </w:rPr>
+        <w:t xml:space="preserve"> (Ex-Licenses) User]</w:t>
+      </w:r>
+    </w:p>
+    <w:p>
+      <w:pPr>
+        <w:ind w:left="720"/>
+        <w:rPr>
+          <w:sz w:val="18"/>
+          <w:szCs w:val="18"/>
+        </w:rPr>
+      </w:pPr>
+      <w:r>
+        <w:rPr>
+          <w:sz w:val="18"/>
+          <w:szCs w:val="18"/>
+        </w:rPr>
+        <w:t>*</w:t>
+      </w:r>
+      <w:r>
+        <w:rPr>
+          <w:b/>
+          <w:sz w:val="18"/>
+          <w:szCs w:val="18"/>
+        </w:rPr>
+        <w:t xml:space="preserve"> Source Nature:</w:t>
+      </w:r>
+      <w:r>
+        <w:rPr>
+          <w:b/>
+          <w:sz w:val="18"/>
+          <w:szCs w:val="18"/>
+        </w:rPr>
+        <w:t xml:space="preserve"> </w:t>
+      </w:r>
+      <w:r>
+        <w:rPr>
+          <w:bCs/>
+          <w:sz w:val="18"/>
+          <w:szCs w:val="18"/>
+        </w:rPr>
+        <w:t>Digital</w:t>
+      </w:r>
+    </w:p>
+    <w:p>
+      <w:pPr>
+        <w:ind w:left="720"/>
+        <w:rPr>
+          <w:sz w:val="18"/>
+          <w:szCs w:val="18"/>
+        </w:rPr>
+      </w:pPr>
+      <w:r>
+        <w:rPr>
+          <w:sz w:val="18"/>
+          <w:szCs w:val="18"/>
+        </w:rPr>
+        <w:t>*</w:t>
+      </w:r>
+      <w:r>
+        <w:rPr>
+          <w:b/>
+          <w:sz w:val="18"/>
+          <w:szCs w:val="18"/>
+        </w:rPr>
+        <w:t xml:space="preserve"> Content Derivation Type:</w:t>
+      </w:r>
+      <w:r>
+        <w:rPr>
+          <w:b/>
+          <w:sz w:val="18"/>
+          <w:szCs w:val="18"/>
+        </w:rPr>
+        <w:t xml:space="preserve"> </w:t>
+      </w:r>
+      <w:r>
+        <w:rPr>
+          <w:bCs/>
+          <w:sz w:val="18"/>
+          <w:szCs w:val="18"/>
+        </w:rPr>
+        <w:t>Downloaded/Collected/Converted</w:t>
+      </w:r>
+    </w:p>
+    <w:p>
+      <w:pPr>
+        <w:ind w:left="720"/>
+        <w:rPr>
+          <w:sz w:val="18"/>
+          <w:szCs w:val="18"/>
+        </w:rPr>
+      </w:pPr>
+      <w:r>
+        <w:rPr>
+          <w:sz w:val="18"/>
+          <w:szCs w:val="18"/>
+        </w:rPr>
+        <w:t>*</w:t>
+      </w:r>
+      <w:r>
+        <w:rPr>
+          <w:b/>
+          <w:sz w:val="18"/>
+          <w:szCs w:val="18"/>
+        </w:rPr>
+        <w:t xml:space="preserve"> Content Acquisition Method:</w:t>
+      </w:r>
+      <w:r>
+        <w:rPr>
+          <w:b/>
+          <w:sz w:val="18"/>
+          <w:szCs w:val="18"/>
+        </w:rPr>
+        <w:t xml:space="preserve"> </w:t>
+      </w:r>
+      <w:r>
+        <w:rPr>
+          <w:bCs/>
+          <w:sz w:val="18"/>
+          <w:szCs w:val="18"/>
+        </w:rPr>
+        <w:t xml:space="preserve">Browser Extension: Image Downloader </w:t>
+      </w:r>
+      <w:r>
+        <w:rPr>
+          <w:bCs/>
+          <w:sz w:val="18"/>
+          <w:szCs w:val="18"/>
+        </w:rPr>
+        <w:t>(</w:t>
+      </w:r>
+      <w:hyperlink r:id="rId20" w:history="1">
+        <w:r>
+          <w:rPr>
+            <w:rStyle w:val="Hyperlink"/>
+            <w:bCs/>
+            <w:sz w:val="18"/>
+            <w:szCs w:val="18"/>
+          </w:rPr>
+          <w:t>https://chromewebstore.google.com/detail/image-downloader/cnpniohnfphhjihaiiggeabnkjhpaldj?pli=1</w:t>
+        </w:r>
+      </w:hyperlink>
+      <w:r>
+        <w:rPr>
+          <w:bCs/>
+          <w:sz w:val="18"/>
+          <w:szCs w:val="18"/>
+        </w:rPr>
+        <w:t>)</w:t>
+      </w:r>
+      <w:r>
+        <w:rPr>
+          <w:bCs/>
+          <w:sz w:val="18"/>
+          <w:szCs w:val="18"/>
+        </w:rPr>
+        <w:t xml:space="preserve"> </w:t>
+      </w:r>
+      <w:r>
+        <w:rPr>
+          <w:bCs/>
+          <w:sz w:val="18"/>
+          <w:szCs w:val="18"/>
+        </w:rPr>
+        <w:t>[Used to download all images from the chapter] -&gt; Application: Adobe Acrobat</w:t>
+      </w:r>
+      <w:r>
+        <w:rPr>
+          <w:bCs/>
+          <w:sz w:val="18"/>
+          <w:szCs w:val="18"/>
+        </w:rPr>
+        <w:t xml:space="preserve"> (</w:t>
+      </w:r>
+      <w:hyperlink r:id="rId21" w:history="1">
+        <w:r>
+          <w:rPr>
+            <w:rStyle w:val="Hyperlink"/>
+            <w:bCs/>
+            <w:sz w:val="18"/>
+            <w:szCs w:val="18"/>
+          </w:rPr>
+          <w:t>https://get.adobe.com/reader/</w:t>
+        </w:r>
+      </w:hyperlink>
+      <w:r>
+        <w:rPr>
+          <w:bCs/>
+          <w:sz w:val="18"/>
+          <w:szCs w:val="18"/>
+        </w:rPr>
+        <w:t>)</w:t>
+      </w:r>
+      <w:r>
+        <w:rPr>
+          <w:bCs/>
+          <w:sz w:val="18"/>
+          <w:szCs w:val="18"/>
+        </w:rPr>
+        <w:t xml:space="preserve"> [Used to combine downloaded images into a single PDF document]</w:t>
+      </w:r>
+    </w:p>
+    <w:p>
+      <w:pPr>
+        <w:ind w:left="720"/>
+        <w:rPr>
+          <w:sz w:val="18"/>
+          <w:szCs w:val="18"/>
+        </w:rPr>
+      </w:pPr>
+      <w:r>
+        <w:rPr>
+          <w:sz w:val="18"/>
+          <w:szCs w:val="18"/>
+        </w:rPr>
+        <w:t>*</w:t>
+      </w:r>
+      <w:r>
+        <w:rPr>
+          <w:b/>
+          <w:sz w:val="18"/>
+          <w:szCs w:val="18"/>
+        </w:rPr>
+        <w:t xml:space="preserve"> Content Acquisition Date:</w:t>
+      </w:r>
+      <w:r>
+        <w:rPr>
+          <w:b/>
+          <w:sz w:val="18"/>
+          <w:szCs w:val="18"/>
+        </w:rPr>
+        <w:t xml:space="preserve"> </w:t>
+      </w:r>
+      <w:r>
+        <w:rPr>
+          <w:bCs/>
+          <w:sz w:val="18"/>
+          <w:szCs w:val="18"/>
+        </w:rPr>
+        <w:t>10/31/2025</w:t>
+      </w:r>
+    </w:p>
+    <w:p>
+      <w:pPr>
+        <w:ind w:left="720"/>
+        <w:rPr>
+          <w:sz w:val="18"/>
+          <w:szCs w:val="18"/>
+        </w:rPr>
+      </w:pPr>
+      <w:r>
+        <w:rPr>
+          <w:sz w:val="18"/>
+          <w:szCs w:val="18"/>
+        </w:rPr>
+        <w:t>*</w:t>
+      </w:r>
+      <w:r>
+        <w:rPr>
+          <w:b/>
+          <w:sz w:val="18"/>
+          <w:szCs w:val="18"/>
+        </w:rPr>
+        <w:t xml:space="preserve"> Content File Format:</w:t>
+      </w:r>
+      <w:r>
+        <w:rPr>
+          <w:b/>
+          <w:sz w:val="18"/>
+          <w:szCs w:val="18"/>
+        </w:rPr>
+        <w:t xml:space="preserve"> </w:t>
+      </w:r>
+      <w:r>
+        <w:rPr>
+          <w:bCs/>
+          <w:sz w:val="18"/>
+          <w:szCs w:val="18"/>
+        </w:rPr>
+        <w:t>.pdf</w:t>
+      </w:r>
+    </w:p>
+    <w:p>
+      <w:pPr>
+        <w:ind w:left="720"/>
+        <w:rPr>
+          <w:sz w:val="18"/>
+          <w:szCs w:val="18"/>
+        </w:rPr>
+      </w:pPr>
+      <w:r>
+        <w:rPr>
+          <w:sz w:val="18"/>
+          <w:szCs w:val="18"/>
+        </w:rPr>
+        <w:t>*</w:t>
+      </w:r>
+      <w:r>
+        <w:rPr>
+          <w:b/>
+          <w:sz w:val="18"/>
+          <w:szCs w:val="18"/>
+        </w:rPr>
+        <w:t xml:space="preserve"> Content Size:</w:t>
+      </w:r>
+      <w:r>
+        <w:rPr>
+          <w:b/>
+          <w:sz w:val="18"/>
+          <w:szCs w:val="18"/>
+        </w:rPr>
+        <w:t xml:space="preserve"> </w:t>
+      </w:r>
+      <w:r>
+        <w:rPr>
+          <w:bCs/>
+          <w:sz w:val="18"/>
+          <w:szCs w:val="18"/>
+        </w:rPr>
+        <w:t>9.</w:t>
+      </w:r>
+      <w:r>
+        <w:rPr>
+          <w:bCs/>
+          <w:sz w:val="18"/>
+          <w:szCs w:val="18"/>
+        </w:rPr>
+        <w:t xml:space="preserve">53 </w:t>
+      </w:r>
+      <w:r>
+        <w:rPr>
+          <w:bCs/>
+          <w:sz w:val="18"/>
+          <w:szCs w:val="18"/>
+        </w:rPr>
+        <w:t>MB</w:t>
+      </w:r>
+    </w:p>
+    <w:p>
+      <w:pPr>
+        <w:ind w:left="720"/>
+        <w:rPr>
+          <w:sz w:val="18"/>
+          <w:szCs w:val="18"/>
+        </w:rPr>
+      </w:pPr>
+      <w:r>
+        <w:rPr>
+          <w:sz w:val="18"/>
+          <w:szCs w:val="18"/>
+        </w:rPr>
+        <w:t>*</w:t>
+      </w:r>
+      <w:r>
+        <w:rPr>
+          <w:b/>
+          <w:sz w:val="18"/>
+          <w:szCs w:val="18"/>
+        </w:rPr>
+        <w:t xml:space="preserve"> Content Attributes:</w:t>
+      </w:r>
+      <w:r>
+        <w:rPr>
+          <w:b/>
+          <w:sz w:val="18"/>
+          <w:szCs w:val="18"/>
+        </w:rPr>
+        <w:t xml:space="preserve"> </w:t>
+      </w:r>
+      <w:r>
+        <w:rPr>
+          <w:bCs/>
+          <w:sz w:val="18"/>
+          <w:szCs w:val="18"/>
+        </w:rPr>
+        <w:t xml:space="preserve">Scan Quality: </w:t>
+      </w:r>
+      <w:r>
+        <w:rPr>
+          <w:bCs/>
+          <w:sz w:val="18"/>
+          <w:szCs w:val="18"/>
+        </w:rPr>
+        <w:t>High</w:t>
+      </w:r>
+      <w:r>
+        <w:rPr>
+          <w:bCs/>
+          <w:sz w:val="18"/>
+          <w:szCs w:val="18"/>
+        </w:rPr>
+        <w:t xml:space="preserve">, Pages Number: </w:t>
+      </w:r>
+      <w:r>
+        <w:rPr>
+          <w:bCs/>
+          <w:sz w:val="18"/>
+          <w:szCs w:val="18"/>
+        </w:rPr>
+        <w:t>35</w:t>
+      </w:r>
+    </w:p>
+    <w:p>
+      <w:pPr>
+        <w:ind w:left="720"/>
+        <w:rPr>
+          <w:sz w:val="18"/>
+          <w:szCs w:val="18"/>
+        </w:rPr>
+      </w:pPr>
+      <w:r>
+        <w:rPr>
+          <w:sz w:val="18"/>
+          <w:szCs w:val="18"/>
+        </w:rPr>
+        <w:t>*</w:t>
+      </w:r>
+      <w:r>
+        <w:rPr>
+          <w:b/>
+          <w:sz w:val="18"/>
+          <w:szCs w:val="18"/>
+        </w:rPr>
+        <w:t xml:space="preserve"> Storage Location:</w:t>
+      </w:r>
+      <w:r>
+        <w:rPr>
+          <w:b/>
+          <w:sz w:val="18"/>
+          <w:szCs w:val="18"/>
+        </w:rPr>
+        <w:t xml:space="preserve"> </w:t>
+      </w:r>
+      <w:proofErr w:type="spellStart"/>
+      <w:r>
+        <w:rPr>
+          <w:bCs/>
+          <w:sz w:val="18"/>
+          <w:szCs w:val="18"/>
+        </w:rPr>
+        <w:t>StorageType</w:t>
+      </w:r>
+      <w:proofErr w:type="spellEnd"/>
+      <w:r>
+        <w:rPr>
+          <w:bCs/>
+          <w:sz w:val="18"/>
+          <w:szCs w:val="18"/>
+        </w:rPr>
+        <w:t xml:space="preserve">: Cloud -&gt; Platform: GitHub -&gt; Account: </w:t>
+      </w:r>
+      <w:proofErr w:type="spellStart"/>
+      <w:r>
+        <w:rPr>
+          <w:bCs/>
+          <w:sz w:val="18"/>
+          <w:szCs w:val="18"/>
+        </w:rPr>
+        <w:t>animekingdomelbaf</w:t>
+      </w:r>
+      <w:proofErr w:type="spellEnd"/>
+      <w:r>
+        <w:rPr>
+          <w:bCs/>
+          <w:sz w:val="18"/>
+          <w:szCs w:val="18"/>
+        </w:rPr>
+        <w:t xml:space="preserve"> -&gt; Repository: </w:t>
+      </w:r>
+      <w:proofErr w:type="spellStart"/>
+      <w:r>
+        <w:rPr>
+          <w:bCs/>
+          <w:sz w:val="18"/>
+          <w:szCs w:val="18"/>
+        </w:rPr>
+        <w:t>kingdomheartsManga</w:t>
+      </w:r>
+      <w:proofErr w:type="spellEnd"/>
+      <w:r>
+        <w:rPr>
+          <w:bCs/>
+          <w:sz w:val="18"/>
+          <w:szCs w:val="18"/>
+        </w:rPr>
+        <w:t xml:space="preserve"> -&gt; File: Manga/Pupa/..</w:t>
+      </w:r>
+    </w:p>
+    <w:p>
+      <w:pPr>
+        <w:ind w:left="720"/>
+        <w:rPr>
+          <w:sz w:val="18"/>
+          <w:szCs w:val="18"/>
+        </w:rPr>
+      </w:pPr>
+      <w:r>
+        <w:rPr>
+          <w:sz w:val="18"/>
+          <w:szCs w:val="18"/>
+        </w:rPr>
+        <w:t>*</w:t>
+      </w:r>
+      <w:r>
+        <w:rPr>
+          <w:b/>
+          <w:sz w:val="18"/>
+          <w:szCs w:val="18"/>
+        </w:rPr>
+        <w:t xml:space="preserve"> Notes:</w:t>
+      </w:r>
+      <w:r>
+        <w:rPr>
+          <w:b/>
+          <w:sz w:val="18"/>
+          <w:szCs w:val="18"/>
+        </w:rPr>
+        <w:t xml:space="preserve"> </w:t>
+      </w:r>
+    </w:p>
+    <w:p>
+      <w:r>
+        <w:br w:type="page"/>
+      </w:r>
+    </w:p>
+    <w:p>
+      <w:pPr>
+        <w:pStyle w:val="ListParagraph"/>
+        <w:numPr>
+          <w:ilvl w:val="0"/>
+          <w:numId w:val="4"/>
+        </w:numPr>
+        <w:rPr>
+          <w:sz w:val="18"/>
+          <w:szCs w:val="18"/>
+        </w:rPr>
+      </w:pPr>
+      <w:r>
+        <w:rPr>
+          <w:bCs/>
+          <w:sz w:val="18"/>
+          <w:szCs w:val="18"/>
+        </w:rPr>
         <w:lastRenderedPageBreak/>
         <w:t>*</w:t>
       </w:r>
@@ -3259,13 +3735,23 @@
         </w:rPr>
         <w:t xml:space="preserve"> </w:t>
       </w:r>
-      <w:r>
-        <w:rPr>
-          <w:bCs/>
-          <w:sz w:val="18"/>
-          <w:szCs w:val="18"/>
-        </w:rPr>
-        <w:t>MangaDex (https://mangadex.org)</w:t>
+      <w:proofErr w:type="spellStart"/>
+      <w:r>
+        <w:rPr>
+          <w:bCs/>
+          <w:sz w:val="18"/>
+          <w:szCs w:val="18"/>
+        </w:rPr>
+        <w:t>MangaDex</w:t>
+      </w:r>
+      <w:proofErr w:type="spellEnd"/>
+      <w:r>
+        <w:rPr>
+          <w:bCs/>
+          <w:sz w:val="18"/>
+          <w:szCs w:val="18"/>
+        </w:rPr>
+        <w:t xml:space="preserve"> (https://mangadex.org)</w:t>
       </w:r>
     </w:p>
     <w:p>
@@ -3299,7 +3785,34 @@
         </w:rPr>
         <w:t xml:space="preserve"> </w:t>
       </w:r>
-      <w:hyperlink r:id="rId18" w:history="1">
+      <w:hyperlink r:id="rId22" w:history="1">
+        <w:r>
+          <w:rPr>
+            <w:rStyle w:val="Hyperlink"/>
+            <w:bCs/>
+            <w:sz w:val="18"/>
+            <w:szCs w:val="18"/>
+          </w:rPr>
+          <w:t>https://mangadex.org/title/f4f3c1b5-a16e-4eca-9bc9-7a9c373a6370/pupa?tab=chapters</w:t>
+        </w:r>
+      </w:hyperlink>
+      <w:r>
+        <w:rPr>
+          <w:bCs/>
+          <w:sz w:val="18"/>
+          <w:szCs w:val="18"/>
+        </w:rPr>
+        <w:t xml:space="preserve"> -&gt;</w:t>
+      </w:r>
+      <w:r>
+        <w:rPr>
+          <w:b/>
+          <w:sz w:val="18"/>
+          <w:szCs w:val="18"/>
+        </w:rPr>
+        <w:t xml:space="preserve"> </w:t>
+      </w:r>
+      <w:hyperlink r:id="rId23" w:history="1">
         <w:r>
           <w:rPr>
             <w:rStyle w:val="Hyperlink"/>
@@ -3356,7 +3869,43 @@
           <w:sz w:val="18"/>
           <w:szCs w:val="18"/>
         </w:rPr>
-        <w:t>https://mangadex.org [MangaDex Server] -&gt; [JManga (Ex-Licenses) User]</w:t>
+        <w:t>https://mangadex.org [</w:t>
+      </w:r>
+      <w:proofErr w:type="spellStart"/>
+      <w:r>
+        <w:rPr>
+          <w:bCs/>
+          <w:sz w:val="18"/>
+          <w:szCs w:val="18"/>
+        </w:rPr>
+        <w:t>MangaDex</w:t>
+      </w:r>
+      <w:proofErr w:type="spellEnd"/>
+      <w:r>
+        <w:rPr>
+          <w:bCs/>
+          <w:sz w:val="18"/>
+          <w:szCs w:val="18"/>
+        </w:rPr>
+        <w:t xml:space="preserve"> Server] -&gt; [</w:t>
+      </w:r>
+      <w:proofErr w:type="spellStart"/>
+      <w:r>
+        <w:rPr>
+          <w:bCs/>
+          <w:sz w:val="18"/>
+          <w:szCs w:val="18"/>
+        </w:rPr>
+        <w:t>JManga</w:t>
+      </w:r>
+      <w:proofErr w:type="spellEnd"/>
+      <w:r>
+        <w:rPr>
+          <w:bCs/>
+          <w:sz w:val="18"/>
+          <w:szCs w:val="18"/>
+        </w:rPr>
+        <w:t xml:space="preserve"> (Ex-Licenses) User]</w:t>
       </w:r>
     </w:p>
     <w:p>
@@ -3486,7 +4035,7 @@
         </w:rPr>
         <w:t>(</w:t>
       </w:r>
-      <w:hyperlink r:id="rId19" w:history="1">
+      <w:hyperlink r:id="rId24" w:history="1">
         <w:r>
           <w:rPr>
             <w:rStyle w:val="Hyperlink"/>
@@ -3529,7 +4078,7 @@
         </w:rPr>
         <w:t xml:space="preserve"> (</w:t>
       </w:r>
-      <w:hyperlink r:id="rId20" w:history="1">
+      <w:hyperlink r:id="rId25" w:history="1">
         <w:r>
           <w:rPr>
             <w:rStyle w:val="Hyperlink"/>
@@ -3796,13 +4345,59 @@
         </w:rPr>
         <w:t xml:space="preserve"> </w:t>
       </w:r>
-      <w:r>
-        <w:rPr>
-          <w:bCs/>
-          <w:sz w:val="18"/>
-          <w:szCs w:val="18"/>
-        </w:rPr>
-        <w:t>StorageType: Cloud -&gt; Platform: GitHub -&gt; Account: animekingdomelbaf -&gt; Repository: kingdomheartsManga -&gt; File: Manga/Pupa/..</w:t>
+      <w:proofErr w:type="spellStart"/>
+      <w:r>
+        <w:rPr>
+          <w:bCs/>
+          <w:sz w:val="18"/>
+          <w:szCs w:val="18"/>
+        </w:rPr>
+        <w:t>StorageType</w:t>
+      </w:r>
+      <w:proofErr w:type="spellEnd"/>
+      <w:r>
+        <w:rPr>
+          <w:bCs/>
+          <w:sz w:val="18"/>
+          <w:szCs w:val="18"/>
+        </w:rPr>
+        <w:t xml:space="preserve">: Cloud -&gt; Platform: GitHub -&gt; Account: </w:t>
+      </w:r>
+      <w:proofErr w:type="spellStart"/>
+      <w:r>
+        <w:rPr>
+          <w:bCs/>
+          <w:sz w:val="18"/>
+          <w:szCs w:val="18"/>
+        </w:rPr>
+        <w:t>animekingdomelbaf</w:t>
+      </w:r>
+      <w:proofErr w:type="spellEnd"/>
+      <w:r>
+        <w:rPr>
+          <w:bCs/>
+          <w:sz w:val="18"/>
+          <w:szCs w:val="18"/>
+        </w:rPr>
+        <w:t xml:space="preserve"> -&gt; Repository: </w:t>
+      </w:r>
+      <w:proofErr w:type="spellStart"/>
+      <w:r>
+        <w:rPr>
+          <w:bCs/>
+          <w:sz w:val="18"/>
+          <w:szCs w:val="18"/>
+        </w:rPr>
+        <w:t>kingdomheartsManga</w:t>
+      </w:r>
+      <w:proofErr w:type="spellEnd"/>
+      <w:r>
+        <w:rPr>
+          <w:bCs/>
+          <w:sz w:val="18"/>
+          <w:szCs w:val="18"/>
+        </w:rPr>
+        <w:t xml:space="preserve"> -&gt; File: Manga/Pupa/..</w:t>
       </w:r>
     </w:p>
     <w:p>
@@ -4015,13 +4610,23 @@
         </w:rPr>
         <w:t xml:space="preserve"> </w:t>
       </w:r>
-      <w:r>
-        <w:rPr>
-          <w:bCs/>
-          <w:sz w:val="18"/>
-          <w:szCs w:val="18"/>
-        </w:rPr>
-        <w:t>MangaDex (https://mangadex.org)</w:t>
+      <w:proofErr w:type="spellStart"/>
+      <w:r>
+        <w:rPr>
+          <w:bCs/>
+          <w:sz w:val="18"/>
+          <w:szCs w:val="18"/>
+        </w:rPr>
+        <w:t>MangaDex</w:t>
+      </w:r>
+      <w:proofErr w:type="spellEnd"/>
+      <w:r>
+        <w:rPr>
+          <w:bCs/>
+          <w:sz w:val="18"/>
+          <w:szCs w:val="18"/>
+        </w:rPr>
+        <w:t xml:space="preserve"> (https://mangadex.org)</w:t>
       </w:r>
     </w:p>
     <w:p>
@@ -4055,7 +4660,34 @@
         </w:rPr>
         <w:t xml:space="preserve"> </w:t>
       </w:r>
-      <w:hyperlink r:id="rId21" w:history="1">
+      <w:hyperlink r:id="rId26" w:history="1">
+        <w:r>
+          <w:rPr>
+            <w:rStyle w:val="Hyperlink"/>
+            <w:bCs/>
+            <w:sz w:val="18"/>
+            <w:szCs w:val="18"/>
+          </w:rPr>
+          <w:t>https://mangadex.org/title/f4f3c1b5-a16e-4eca-9bc9-7a9c373a6370/pupa?tab=chapters</w:t>
+        </w:r>
+      </w:hyperlink>
+      <w:r>
+        <w:rPr>
+          <w:bCs/>
+          <w:sz w:val="18"/>
+          <w:szCs w:val="18"/>
+        </w:rPr>
+        <w:t xml:space="preserve"> -&gt;</w:t>
+      </w:r>
+      <w:r>
+        <w:rPr>
+          <w:b/>
+          <w:sz w:val="18"/>
+          <w:szCs w:val="18"/>
+        </w:rPr>
+        <w:t xml:space="preserve"> </w:t>
+      </w:r>
+      <w:hyperlink r:id="rId27" w:history="1">
         <w:r>
           <w:rPr>
             <w:rStyle w:val="Hyperlink"/>
@@ -4112,7 +4744,43 @@
           <w:sz w:val="18"/>
           <w:szCs w:val="18"/>
         </w:rPr>
-        <w:t>https://mangadex.org [MangaDex Server] -&gt; [JManga (Ex-Licenses) User]</w:t>
+        <w:t>https://mangadex.org [</w:t>
+      </w:r>
+      <w:proofErr w:type="spellStart"/>
+      <w:r>
+        <w:rPr>
+          <w:bCs/>
+          <w:sz w:val="18"/>
+          <w:szCs w:val="18"/>
+        </w:rPr>
+        <w:t>MangaDex</w:t>
+      </w:r>
+      <w:proofErr w:type="spellEnd"/>
+      <w:r>
+        <w:rPr>
+          <w:bCs/>
+          <w:sz w:val="18"/>
+          <w:szCs w:val="18"/>
+        </w:rPr>
+        <w:t xml:space="preserve"> Server] -&gt; [</w:t>
+      </w:r>
+      <w:proofErr w:type="spellStart"/>
+      <w:r>
+        <w:rPr>
+          <w:bCs/>
+          <w:sz w:val="18"/>
+          <w:szCs w:val="18"/>
+        </w:rPr>
+        <w:t>JManga</w:t>
+      </w:r>
+      <w:proofErr w:type="spellEnd"/>
+      <w:r>
+        <w:rPr>
+          <w:bCs/>
+          <w:sz w:val="18"/>
+          <w:szCs w:val="18"/>
+        </w:rPr>
+        <w:t xml:space="preserve"> (Ex-Licenses) User]</w:t>
       </w:r>
     </w:p>
     <w:p>
@@ -4242,7 +4910,7 @@
         </w:rPr>
         <w:t>(</w:t>
       </w:r>
-      <w:hyperlink r:id="rId22" w:history="1">
+      <w:hyperlink r:id="rId28" w:history="1">
         <w:r>
           <w:rPr>
             <w:rStyle w:val="Hyperlink"/>
@@ -4285,7 +4953,7 @@
         </w:rPr>
         <w:t xml:space="preserve"> (</w:t>
       </w:r>
-      <w:hyperlink r:id="rId23" w:history="1">
+      <w:hyperlink r:id="rId29" w:history="1">
         <w:r>
           <w:rPr>
             <w:rStyle w:val="Hyperlink"/>
@@ -4560,13 +5228,59 @@
         </w:rPr>
         <w:t xml:space="preserve"> </w:t>
       </w:r>
-      <w:r>
-        <w:rPr>
-          <w:bCs/>
-          <w:sz w:val="18"/>
-          <w:szCs w:val="18"/>
-        </w:rPr>
-        <w:t>StorageType: Cloud -&gt; Platform: GitHub -&gt; Account: animekingdomelbaf -&gt; Repository: kingdomheartsManga -&gt; File: Manga/Pupa/..</w:t>
+      <w:proofErr w:type="spellStart"/>
+      <w:r>
+        <w:rPr>
+          <w:bCs/>
+          <w:sz w:val="18"/>
+          <w:szCs w:val="18"/>
+        </w:rPr>
+        <w:t>StorageType</w:t>
+      </w:r>
+      <w:proofErr w:type="spellEnd"/>
+      <w:r>
+        <w:rPr>
+          <w:bCs/>
+          <w:sz w:val="18"/>
+          <w:szCs w:val="18"/>
+        </w:rPr>
+        <w:t xml:space="preserve">: Cloud -&gt; Platform: GitHub -&gt; Account: </w:t>
+      </w:r>
+      <w:proofErr w:type="spellStart"/>
+      <w:r>
+        <w:rPr>
+          <w:bCs/>
+          <w:sz w:val="18"/>
+          <w:szCs w:val="18"/>
+        </w:rPr>
+        <w:t>animekingdomelbaf</w:t>
+      </w:r>
+      <w:proofErr w:type="spellEnd"/>
+      <w:r>
+        <w:rPr>
+          <w:bCs/>
+          <w:sz w:val="18"/>
+          <w:szCs w:val="18"/>
+        </w:rPr>
+        <w:t xml:space="preserve"> -&gt; Repository: </w:t>
+      </w:r>
+      <w:proofErr w:type="spellStart"/>
+      <w:r>
+        <w:rPr>
+          <w:bCs/>
+          <w:sz w:val="18"/>
+          <w:szCs w:val="18"/>
+        </w:rPr>
+        <w:t>kingdomheartsManga</w:t>
+      </w:r>
+      <w:proofErr w:type="spellEnd"/>
+      <w:r>
+        <w:rPr>
+          <w:bCs/>
+          <w:sz w:val="18"/>
+          <w:szCs w:val="18"/>
+        </w:rPr>
+        <w:t xml:space="preserve"> -&gt; File: Manga/Pupa/..</w:t>
       </w:r>
     </w:p>
     <w:p>
@@ -4772,13 +5486,23 @@
         </w:rPr>
         <w:t xml:space="preserve"> </w:t>
       </w:r>
-      <w:r>
-        <w:rPr>
-          <w:bCs/>
-          <w:sz w:val="18"/>
-          <w:szCs w:val="18"/>
-        </w:rPr>
-        <w:t>MangaDex (https://mangadex.org)</w:t>
+      <w:proofErr w:type="spellStart"/>
+      <w:r>
+        <w:rPr>
+          <w:bCs/>
+          <w:sz w:val="18"/>
+          <w:szCs w:val="18"/>
+        </w:rPr>
+        <w:t>MangaDex</w:t>
+      </w:r>
+      <w:proofErr w:type="spellEnd"/>
+      <w:r>
+        <w:rPr>
+          <w:bCs/>
+          <w:sz w:val="18"/>
+          <w:szCs w:val="18"/>
+        </w:rPr>
+        <w:t xml:space="preserve"> (https://mangadex.org)</w:t>
       </w:r>
     </w:p>
     <w:p>
@@ -4812,7 +5536,34 @@
         </w:rPr>
         <w:t xml:space="preserve"> </w:t>
       </w:r>
-      <w:hyperlink r:id="rId24" w:history="1">
+      <w:hyperlink r:id="rId30" w:history="1">
+        <w:r>
+          <w:rPr>
+            <w:rStyle w:val="Hyperlink"/>
+            <w:bCs/>
+            <w:sz w:val="18"/>
+            <w:szCs w:val="18"/>
+          </w:rPr>
+          <w:t>https://mangadex.org/title/f4f3c1b5-a16e-4eca-9bc9-7a9c373a6370/pupa?tab=chapters</w:t>
+        </w:r>
+      </w:hyperlink>
+      <w:r>
+        <w:rPr>
+          <w:bCs/>
+          <w:sz w:val="18"/>
+          <w:szCs w:val="18"/>
+        </w:rPr>
+        <w:t xml:space="preserve"> -&gt;</w:t>
+      </w:r>
+      <w:r>
+        <w:rPr>
+          <w:b/>
+          <w:sz w:val="18"/>
+          <w:szCs w:val="18"/>
+        </w:rPr>
+        <w:t xml:space="preserve"> </w:t>
+      </w:r>
+      <w:hyperlink r:id="rId31" w:history="1">
         <w:r>
           <w:rPr>
             <w:rStyle w:val="Hyperlink"/>
@@ -4869,7 +5620,43 @@
           <w:sz w:val="18"/>
           <w:szCs w:val="18"/>
         </w:rPr>
-        <w:t>https://mangadex.org [MangaDex Server] -&gt; [JManga (Ex-Licenses) User]</w:t>
+        <w:t>https://mangadex.org [</w:t>
+      </w:r>
+      <w:proofErr w:type="spellStart"/>
+      <w:r>
+        <w:rPr>
+          <w:bCs/>
+          <w:sz w:val="18"/>
+          <w:szCs w:val="18"/>
+        </w:rPr>
+        <w:t>MangaDex</w:t>
+      </w:r>
+      <w:proofErr w:type="spellEnd"/>
+      <w:r>
+        <w:rPr>
+          <w:bCs/>
+          <w:sz w:val="18"/>
+          <w:szCs w:val="18"/>
+        </w:rPr>
+        <w:t xml:space="preserve"> Server] -&gt; [</w:t>
+      </w:r>
+      <w:proofErr w:type="spellStart"/>
+      <w:r>
+        <w:rPr>
+          <w:bCs/>
+          <w:sz w:val="18"/>
+          <w:szCs w:val="18"/>
+        </w:rPr>
+        <w:t>JManga</w:t>
+      </w:r>
+      <w:proofErr w:type="spellEnd"/>
+      <w:r>
+        <w:rPr>
+          <w:bCs/>
+          <w:sz w:val="18"/>
+          <w:szCs w:val="18"/>
+        </w:rPr>
+        <w:t xml:space="preserve"> (Ex-Licenses) User]</w:t>
       </w:r>
     </w:p>
     <w:p>
@@ -4999,7 +5786,7 @@
         </w:rPr>
         <w:t>(</w:t>
       </w:r>
-      <w:hyperlink r:id="rId25" w:history="1">
+      <w:hyperlink r:id="rId32" w:history="1">
         <w:r>
           <w:rPr>
             <w:rStyle w:val="Hyperlink"/>
@@ -5042,7 +5829,7 @@
         </w:rPr>
         <w:t xml:space="preserve"> (</w:t>
       </w:r>
-      <w:hyperlink r:id="rId26" w:history="1">
+      <w:hyperlink r:id="rId33" w:history="1">
         <w:r>
           <w:rPr>
             <w:rStyle w:val="Hyperlink"/>
@@ -5309,13 +6096,59 @@
         </w:rPr>
         <w:t xml:space="preserve"> </w:t>
       </w:r>
-      <w:r>
-        <w:rPr>
-          <w:bCs/>
-          <w:sz w:val="18"/>
-          <w:szCs w:val="18"/>
-        </w:rPr>
-        <w:t>StorageType: Cloud -&gt; Platform: GitHub -&gt; Account: animekingdomelbaf -&gt; Repository: kingdomheartsManga -&gt; File: Manga/Pupa/..</w:t>
+      <w:proofErr w:type="spellStart"/>
+      <w:r>
+        <w:rPr>
+          <w:bCs/>
+          <w:sz w:val="18"/>
+          <w:szCs w:val="18"/>
+        </w:rPr>
+        <w:t>StorageType</w:t>
+      </w:r>
+      <w:proofErr w:type="spellEnd"/>
+      <w:r>
+        <w:rPr>
+          <w:bCs/>
+          <w:sz w:val="18"/>
+          <w:szCs w:val="18"/>
+        </w:rPr>
+        <w:t xml:space="preserve">: Cloud -&gt; Platform: GitHub -&gt; Account: </w:t>
+      </w:r>
+      <w:proofErr w:type="spellStart"/>
+      <w:r>
+        <w:rPr>
+          <w:bCs/>
+          <w:sz w:val="18"/>
+          <w:szCs w:val="18"/>
+        </w:rPr>
+        <w:t>animekingdomelbaf</w:t>
+      </w:r>
+      <w:proofErr w:type="spellEnd"/>
+      <w:r>
+        <w:rPr>
+          <w:bCs/>
+          <w:sz w:val="18"/>
+          <w:szCs w:val="18"/>
+        </w:rPr>
+        <w:t xml:space="preserve"> -&gt; Repository: </w:t>
+      </w:r>
+      <w:proofErr w:type="spellStart"/>
+      <w:r>
+        <w:rPr>
+          <w:bCs/>
+          <w:sz w:val="18"/>
+          <w:szCs w:val="18"/>
+        </w:rPr>
+        <w:t>kingdomheartsManga</w:t>
+      </w:r>
+      <w:proofErr w:type="spellEnd"/>
+      <w:r>
+        <w:rPr>
+          <w:bCs/>
+          <w:sz w:val="18"/>
+          <w:szCs w:val="18"/>
+        </w:rPr>
+        <w:t xml:space="preserve"> -&gt; File: Manga/Pupa/..</w:t>
       </w:r>
     </w:p>
     <w:p>

</xml_diff>